<commit_message>
m: upload new report format
</commit_message>
<xml_diff>
--- a/report/tai_lieu_tong_hop_11_khoa.docx
+++ b/report/tai_lieu_tong_hop_11_khoa.docx
@@ -2,18 +2,62 @@
 <file path=word/document.xml><?xml version="1.0" encoding="utf-8"?>
 <w:document xmlns:w="http://schemas.openxmlformats.org/wordprocessingml/2006/main" xmlns:m="http://schemas.openxmlformats.org/officeDocument/2006/math" xmlns:r="http://schemas.openxmlformats.org/officeDocument/2006/relationships" xmlns:o="urn:schemas-microsoft-com:office:office" xmlns:v="urn:schemas-microsoft-com:vml" xmlns:w10="urn:schemas-microsoft-com:office:word" xmlns:a="http://schemas.openxmlformats.org/drawingml/2006/main" xmlns:pic="http://schemas.openxmlformats.org/drawingml/2006/picture" xmlns:wp="http://schemas.openxmlformats.org/drawingml/2006/wordprocessingDrawing">
   <w:body>
-    <w:bookmarkStart w:id="22" w:name="X6bc6852c505a5bbad1084913e42b3ee7b9fb3e9"/>
-    <w:p>
-      <w:pPr>
-        <w:pStyle w:val="Heading1"/>
-      </w:pPr>
-      <w:r>
-        <w:t xml:space="preserve">BÁO CÁO TỔNG HỢP HOẠT ĐỘNG NGHIÊN CỨU KHOA HỌC VÀ ĐỔI MỚI SÁNG TẠO CẤP SINH VIÊN CHÍNH QUY NĂM 2026</w:t>
-      </w:r>
-    </w:p>
     <w:p>
       <w:pPr>
         <w:pStyle w:val="FirstParagraph"/>
+      </w:pPr>
+      <w:r>
+        <w:t xml:space="preserve">TRƯỜNG ĐẠI HỌC BÁCH KHOA</w:t>
+      </w:r>
+      <w:r>
+        <w:t xml:space="preserve"> </w:t>
+      </w:r>
+      <w:r>
+        <w:t xml:space="preserve">—————</w:t>
+      </w:r>
+    </w:p>
+    <w:p>
+      <w:pPr>
+        <w:pStyle w:val="BodyText"/>
+      </w:pPr>
+      <w:r>
+        <w:t xml:space="preserve">CỘNG HÒA XÃ HỘI CHỦ NGHĨA VIỆT NAM</w:t>
+      </w:r>
+      <w:r>
+        <w:t xml:space="preserve"> </w:t>
+      </w:r>
+      <w:r>
+        <w:t xml:space="preserve">Độc lập - Tự do - Hạnh phúc</w:t>
+      </w:r>
+      <w:r>
+        <w:t xml:space="preserve"> </w:t>
+      </w:r>
+      <w:r>
+        <w:t xml:space="preserve">—————————</w:t>
+      </w:r>
+    </w:p>
+    <w:p>
+      <w:pPr>
+        <w:pStyle w:val="BodyText"/>
+      </w:pPr>
+      <w:r>
+        <w:t xml:space="preserve">Thành phố Hồ Chí Minh, ngày 11 tháng 6 năm 2026</w:t>
+      </w:r>
+    </w:p>
+    <w:p>
+      <w:pPr>
+        <w:pStyle w:val="BodyText"/>
+      </w:pPr>
+      <w:r>
+        <w:t xml:space="preserve">KẾ HOẠCH TỔ CHỨC NGHIÊN CỨU KHOA HỌC</w:t>
+      </w:r>
+      <w:r>
+        <w:t xml:space="preserve">VÀ ĐỔI MỚI SÁNG TẠO CẤP SINH VIÊN 2026</w:t>
+      </w:r>
+    </w:p>
+    <w:p>
+      <w:pPr>
+        <w:pStyle w:val="BodyText"/>
       </w:pPr>
       <w:r>
         <w:rPr>
@@ -44,7 +88,7 @@
         <w:pStyle w:val="FirstParagraph"/>
       </w:pPr>
       <w:r>
-        <w:t xml:space="preserve">Dưới đây là tóm tắt định hướng và kế hoạch tổ chức hoạt động Nghiên cứu Khoa học và Đổi mới Sáng tạo (NCKH &amp; ĐMST) cấp sinh viên của 10 khoa chuyên môn thuộc trường trong chu kỳ 12 tháng (từ tháng 6/2026 đến tháng 5/2027):</w:t>
+        <w:t xml:space="preserve">Dưới đây là tóm tắt định hướng chi tiết và lộ trình triển khai hoạt động Nghiên cứu Khoa học và Đổi mới Sáng tạo (NCKH &amp; ĐMST) cấp sinh viên của 10 khoa chuyên môn thuộc trường trong chu kỳ 12 tháng (từ tháng 6/2026 đến tháng 5/2027):</w:t>
       </w:r>
     </w:p>
     <w:p>
@@ -72,10 +116,10 @@
           <w:b/>
           <w:bCs/>
         </w:rPr>
-        <w:t xml:space="preserve">Mục tiêu</w:t>
-      </w:r>
-      <w:r>
-        <w:t xml:space="preserve">: Thí điểm mô hình tổ chức bài bản để nâng cao tỷ lệ tham gia NCKH của sinh viên, hình thành các nhóm nghiên cứu có định hướng chuyên môn kế thừa và có cơ chế ghi nhận xứng đáng cho giảng viên hướng dẫn (GVHD).</w:t>
+        <w:t xml:space="preserve">Mục tiêu và Tờ trình</w:t>
+      </w:r>
+      <w:r>
+        <w:t xml:space="preserve">: Thực hiện theo Tờ trình số 151/TTr-ĐHBK ngày 05/06/2026, Khoa triển khai kế hoạch thí điểm 12 tháng nhằm thiết lập quy trình tổ chức NCKH sinh viên chuẩn hóa, làm tiền đề nhân rộng và lặp lại hiệu quả từ năm 2027.</w:t>
       </w:r>
     </w:p>
     <w:p>
@@ -91,10 +135,29 @@
           <w:b/>
           <w:bCs/>
         </w:rPr>
-        <w:t xml:space="preserve">Lộ trình</w:t>
-      </w:r>
-      <w:r>
-        <w:t xml:space="preserve">: Triển khai đề tài NCKH &amp; ĐMST thành 02 đợt. Xét duyệt đợt 1 vào tháng 7/2026 (nghiệm thu tháng 10/2026); đợt 2 xét duyệt tháng 11-12/2026 (nghiệm thu tháng 4/2027) và quyết toán toàn bộ vào tháng 5/2027.</w:t>
+        <w:t xml:space="preserve">Định hướng chuyên môn</w:t>
+      </w:r>
+      <w:r>
+        <w:t xml:space="preserve">: Khoa tập trung huy động đông đảo lực lượng giảng viên hướng dẫn để hình thành các nhóm nghiên cứu nòng cốt, tạo tính kế thừa sản phẩm giữa các thế hệ sinh viên thay vì triển khai rời rạc. Kết quả nghiên cứu được hệ thống hóa làm minh chứng phục vụ kiểm định chất lượng đào tạo và làm nguồn sản phẩm tham gia các cuộc thi học thuật lớn.</w:t>
+      </w:r>
+    </w:p>
+    <w:p>
+      <w:pPr>
+        <w:pStyle w:val="Compact"/>
+        <w:numPr>
+          <w:ilvl w:val="0"/>
+          <w:numId w:val="1001"/>
+        </w:numPr>
+      </w:pPr>
+      <w:r>
+        <w:rPr>
+          <w:b/>
+          <w:bCs/>
+        </w:rPr>
+        <w:t xml:space="preserve">Lộ trình triển khai</w:t>
+      </w:r>
+      <w:r>
+        <w:t xml:space="preserve">: Tiến trình được chia làm 02 đợt. Đợt 1 tiếp nhận và xét duyệt đề tài trong tháng 7/2026 (nghiệm thu vào tháng 10/2026); Đợt 2 xét duyệt vào tháng 11-12/2026 (nghiệm thu tháng 4/2027) và thực hiện thanh lý quyết toán toàn bộ kinh phí vào tháng 5/2027.</w:t>
       </w:r>
     </w:p>
     <w:p>
@@ -122,10 +185,10 @@
           <w:b/>
           <w:bCs/>
         </w:rPr>
-        <w:t xml:space="preserve">Mục tiêu</w:t>
-      </w:r>
-      <w:r>
-        <w:t xml:space="preserve">: Thúc đẩy sinh viên tham gia NCKH trên tất cả các hệ đào tạo (Tiêu chuẩn, Kỹ sư tài năng, PFIEV, Đào tạo Quốc tế OISP).</w:t>
+        <w:t xml:space="preserve">Mục tiêu và Tờ trình</w:t>
+      </w:r>
+      <w:r>
+        <w:t xml:space="preserve">: Thực hiện theo Tờ trình số 178/KTXD ngày 15/06/2026, Khoa hướng tới thúc đẩy mạnh mẽ phong trào NCKH và ĐMST trên tất cả các chương trình đào tạo của Khoa (Tiêu chuẩn, Kỹ sư tài năng - KSTN, PFIEV, và Đào tạo Quốc tế OISP).</w:t>
       </w:r>
     </w:p>
     <w:p>
@@ -141,10 +204,10 @@
           <w:b/>
           <w:bCs/>
         </w:rPr>
-        <w:t xml:space="preserve">Lộ trình</w:t>
-      </w:r>
-      <w:r>
-        <w:t xml:space="preserve">: Triển khai theo kế hoạch chung của Phòng KH&amp;CN. Tiếp nhận đề xuất từ tháng 6-7/2026, xét duyệt trong tháng 7/2026, thực hiện từ tháng 11/2026 đến tháng 11/2027 và nghiệm thu quyết toán vào tháng 11/2027.</w:t>
+        <w:t xml:space="preserve">Lộ trình triển khai</w:t>
+      </w:r>
+      <w:r>
+        <w:t xml:space="preserve">: Quy trình thực hiện bám sát kế hoạch của Phòng KH&amp;CN: Thông báo đăng ký và tiếp nhận đề xuất của sinh viên trong tháng 6-7/2026; Thành lập Hội đồng xét duyệt cấp Khoa trong tháng 7/2026; Tổng hợp danh mục vật tư gửi Phòng KH&amp;CN mua sắm trong tháng 7-8/2026; Ký hợp đồng triển khai từ tháng 8-9/2026. Nghiệm thu đề tài vào tháng 4/2027 và quyết toán dứt điểm vào tháng 5/2027.</w:t>
       </w:r>
     </w:p>
     <w:p>
@@ -172,10 +235,10 @@
           <w:b/>
           <w:bCs/>
         </w:rPr>
-        <w:t xml:space="preserve">Mục tiêu</w:t>
-      </w:r>
-      <w:r>
-        <w:t xml:space="preserve">: Chia các nhóm nghiên cứu sinh viên thành 2 hình thức: Thực nghiệm chế tạo (Nhóm A) và Thuần túy mô phỏng tính toán (Nhóm B). Dành riêng 27,5 triệu đồng tổ chức Hội thảo khoa học sinh viên tại khoa để trưng bày, triển lãm sản phẩm.</w:t>
+        <w:t xml:space="preserve">Mục tiêu và Định hướng</w:t>
+      </w:r>
+      <w:r>
+        <w:t xml:space="preserve">: Khuyến khích tinh thần sáng tạo học thuật, phát triển năng lực nghiên cứu độc lập và khả năng ứng dụng thực tiễn của sinh viên. Khoa chủ trương chia các nhóm nghiên cứu sinh viên thành 2 hình thức: Nhóm A (Thực nghiệm chế tạo thiết bị, mô hình sinh học) và Nhóm B (Thuần túy mô phỏng tính toán lý thuyết).</w:t>
       </w:r>
     </w:p>
     <w:p>
@@ -191,10 +254,10 @@
           <w:b/>
           <w:bCs/>
         </w:rPr>
-        <w:t xml:space="preserve">Lộ trình</w:t>
-      </w:r>
-      <w:r>
-        <w:t xml:space="preserve">: Thực hiện trong vòng 12 tháng theo quy trình chung của Nhà trường.</w:t>
+        <w:t xml:space="preserve">Hoạt động và Lộ trình</w:t>
+      </w:r>
+      <w:r>
+        <w:t xml:space="preserve">: Triển khai trong vòng 12 tháng theo quy trình chung của Nhà trường. Đặc biệt, Khoa dành riêng một phần kinh phí để tổ chức Hội thảo khoa học sinh viên cấp Khoa nhằm trưng bày sản phẩm thực tế, báo cáo kết quả học thuật và tạo diễn đàn trao đổi chuyên môn giữa sinh viên, giảng viên và các phòng thí nghiệm.</w:t>
       </w:r>
     </w:p>
     <w:p>
@@ -222,10 +285,10 @@
           <w:b/>
           <w:bCs/>
         </w:rPr>
-        <w:t xml:space="preserve">Mục tiêu</w:t>
-      </w:r>
-      <w:r>
-        <w:t xml:space="preserve">: Ưu tiên các đề tài có mục tiêu đầu ra kiểm chứng được (mô hình vật lý, thiết bị thử nghiệm về xe tự hành, hệ thống giao thông thông minh, hoặc phần mềm ứng dụng). Ưu tiên hỗ trợ sinh viên thực hiện học phần tốt nghiệp.</w:t>
+        <w:t xml:space="preserve">Mục tiêu và Kế hoạch</w:t>
+      </w:r>
+      <w:r>
+        <w:t xml:space="preserve">: Thực hiện theo Kế hoạch số 49/KH-KTGT ngày 12/06/2026, Khoa ưu tiên các đề tài hướng đến sản phẩm đầu ra kiểm chứng trực quan bao gồm mô hình vật lý, drone, xe tự hành, thiết bị thử nghiệm thực tế hoặc các phần mềm ứng dụng chuyên ngành điều khiển giao thông thông minh.</w:t>
       </w:r>
     </w:p>
     <w:p>
@@ -241,10 +304,10 @@
           <w:b/>
           <w:bCs/>
         </w:rPr>
-        <w:t xml:space="preserve">Lộ trình</w:t>
-      </w:r>
-      <w:r>
-        <w:t xml:space="preserve">: Nhận hồ sơ đăng ký trước 31/07/2026, xét duyệt tháng 8/2026, thực hiện từ tháng 11/2026 đến tháng 11/2027 và thanh lý vào ngày 15/11/2027.</w:t>
+        <w:t xml:space="preserve">Lộ trình và Đối tượng</w:t>
+      </w:r>
+      <w:r>
+        <w:t xml:space="preserve">: Đối tượng tham gia là sinh viên tất cả các hệ, trong đó ưu tiên sinh viên đang làm học phần tốt nghiệp. Nhận hồ sơ đăng ký trước ngày 31/07/2026, xét duyệt trong tháng 8/2026, thực hiện nghiên cứu từ tháng 11/2026 đến tháng 11/2027, nghiệm thu cấp Khoa vào tháng 10/2027 và thanh lý hợp đồng vào ngày 15/11/2027.</w:t>
       </w:r>
     </w:p>
     <w:p>
@@ -272,10 +335,10 @@
           <w:b/>
           <w:bCs/>
         </w:rPr>
-        <w:t xml:space="preserve">Mục tiêu</w:t>
-      </w:r>
-      <w:r>
-        <w:t xml:space="preserve">: Tập trung vào các đề tài nghiên cứu thực nghiệm cơ học đá, địa kỹ thuật và khảo sát thực địa đặc thù ngành. Sản phẩm kỳ vọng là các công bố quốc tế (tạp chí Scopus Q3).</w:t>
+        <w:t xml:space="preserve">Mục tiêu và Định hướng</w:t>
+      </w:r>
+      <w:r>
+        <w:t xml:space="preserve">: Tập trung phát triển các đề tài nghiên cứu thực nghiệm chuyên sâu về cơ học đá, cơ học đất, địa kỹ thuật công trình và khảo sát thực địa đặc thù ngành. Cam kết đầu ra chất lượng cao là các công bố quốc tế uy tín (tạp chí thuộc danh mục Scopus Q3).</w:t>
       </w:r>
     </w:p>
     <w:p>
@@ -291,10 +354,10 @@
           <w:b/>
           <w:bCs/>
         </w:rPr>
-        <w:t xml:space="preserve">Lộ trình</w:t>
-      </w:r>
-      <w:r>
-        <w:t xml:space="preserve">: Thực hiện theo chu kỳ 6-12 tháng, ưu tiên mua sắm thiết bị chuyên dụng phục vụ đo đạc địa kỹ thuật từ đợt 1.</w:t>
+        <w:t xml:space="preserve">Lộ trình triển khai</w:t>
+      </w:r>
+      <w:r>
+        <w:t xml:space="preserve">: Triển khai theo chu kỳ 6-12 tháng. Để đảm bảo tiến độ nghiên cứu thực nghiệm tại phòng thí nghiệm, Khoa ưu tiên tổng hợp và thực hiện quy trình mua sắm các thiết bị đo lường chuyên dụng ngay từ đợt đầu tiên.</w:t>
       </w:r>
     </w:p>
     <w:p>
@@ -322,10 +385,10 @@
           <w:b/>
           <w:bCs/>
         </w:rPr>
-        <w:t xml:space="preserve">Mục tiêu</w:t>
-      </w:r>
-      <w:r>
-        <w:t xml:space="preserve">: Khuyến khích các đề tài nghiên cứu chế tạo vật liệu mới (vật liệu nano oxit làm pin lithium-ion, màng polymer xuyên thấu, composite polymer sinh học tái tạo mô xương…).</w:t>
+        <w:t xml:space="preserve">Mục tiêu và Định hướng</w:t>
+      </w:r>
+      <w:r>
+        <w:t xml:space="preserve">: Khuyến khích các đề tài nghiên cứu chế tạo vật liệu mới ứng dụng công nghệ cao và thân thiện với môi trường. Các hướng nghiên cứu chủ đạo gồm chế tạo vật liệu nano oxit kim loại làm anode cho pin lithium-ion, bê tông tự liền trong môi trường đặc thù, vật liệu in 3D từ nhựa tái chế và chế tạo khuôn concave vi mô.</w:t>
       </w:r>
     </w:p>
     <w:p>
@@ -341,10 +404,10 @@
           <w:b/>
           <w:bCs/>
         </w:rPr>
-        <w:t xml:space="preserve">Lộ trình</w:t>
-      </w:r>
-      <w:r>
-        <w:t xml:space="preserve">: Bám sát quy trình mua sắm vật tư hóa chất nghiêm ngặt để đảm bảo tiến độ triển khai đề tài thực nghiệm 12 tháng.</w:t>
+        <w:t xml:space="preserve">Lộ trình triển khai</w:t>
+      </w:r>
+      <w:r>
+        <w:t xml:space="preserve">: Triển khai chu kỳ 12 tháng. Khoa thực hiện rà soát và lập kế hoạch mua sắm hóa chất, vật tư thí nghiệm nghiêm ngặt từ sớm để tránh tình trạng chậm trễ mẫu thực nghiệm của sinh viên.</w:t>
       </w:r>
     </w:p>
     <w:p>
@@ -372,10 +435,10 @@
           <w:b/>
           <w:bCs/>
         </w:rPr>
-        <w:t xml:space="preserve">Mục tiêu</w:t>
-      </w:r>
-      <w:r>
-        <w:t xml:space="preserve">: Triển khai các đề tài ứng dụng công nghệ hóa học - sinh học xử lý ô nhiễm nước thải, khí thải (sử dụng quá trình Fenton điện hóa, hoạt hóa peroxymonosulfate…).</w:t>
+        <w:t xml:space="preserve">Mục tiêu và Định hướng</w:t>
+      </w:r>
+      <w:r>
+        <w:t xml:space="preserve">: Tập trung vào các nghiên cứu ứng dụng công nghệ hóa-sinh hiện đại giải quyết các thách thức môi trường thực tế. Các đề tài tiêu biểu gồm ứng dụng Fenton điện hóa và hoạt hóa peroxymonosulfate xử lý nước thải dệt nhuộm, khảo sát khả năng chịu mặn và tương thích Bacillus velezensis và Trichoderma asperellum hướng đến phát triển chế phẩm sinh học phục vụ nông nghiệp sạch.</w:t>
       </w:r>
     </w:p>
     <w:p>
@@ -391,10 +454,10 @@
           <w:b/>
           <w:bCs/>
         </w:rPr>
-        <w:t xml:space="preserve">Lộ trình</w:t>
-      </w:r>
-      <w:r>
-        <w:t xml:space="preserve">: Bắt đầu triển khai từ tháng 8/2026 đến tháng 7/2027.</w:t>
+        <w:t xml:space="preserve">Lộ trình triển khai</w:t>
+      </w:r>
+      <w:r>
+        <w:t xml:space="preserve">: Triển khai từ tháng 08/2026 đến tháng 07/2027. Khoa nỗ lực tối ưu hóa phân bổ nguồn kinh phí thực tế của nhà trường để đáp ứng nhu cầu thực hiện đề tài rất lớn của sinh viên.</w:t>
       </w:r>
     </w:p>
     <w:p>
@@ -422,10 +485,10 @@
           <w:b/>
           <w:bCs/>
         </w:rPr>
-        <w:t xml:space="preserve">Mục tiêu</w:t>
-      </w:r>
-      <w:r>
-        <w:t xml:space="preserve">: Đẩy mạnh các nhóm nghiên cứu sinh viên định hướng tạo ra công bố khoa học tại các hội nghị có phản biện thuộc IEEE/Springer/ACM hoặc Scopus Index; tham gia các cuộc thi công nghệ lớn (Robocon, Huawei ICT Competition…).</w:t>
+        <w:t xml:space="preserve">Mục tiêu và Định hướng</w:t>
+      </w:r>
+      <w:r>
+        <w:t xml:space="preserve">: Thúc đẩy nghiên cứu khoa học sinh viên đỉnh cao gắn liền với các công bố khoa học uy tín quốc tế và tham gia giải thưởng học thuật lớn. Định hướng đầu ra là bài báo đăng tại hội nghị có phản biện thuộc IEEE/Springer/ACM, Scopus Index hoặc tạp chí tính điểm của Hội đồng Giáo sư Nhà nước.</w:t>
       </w:r>
     </w:p>
     <w:p>
@@ -441,10 +504,10 @@
           <w:b/>
           <w:bCs/>
         </w:rPr>
-        <w:t xml:space="preserve">Lộ trình</w:t>
-      </w:r>
-      <w:r>
-        <w:t xml:space="preserve">: Xét duyệt và mua sắm thiết bị trong tháng 8/2026, nghiệm thu và thanh lý vào tháng 5/2027.</w:t>
+        <w:t xml:space="preserve">Lộ trình triển khai</w:t>
+      </w:r>
+      <w:r>
+        <w:t xml:space="preserve">: Xét duyệt đề tài và mua sắm thiết bị phần cứng/phần mềm trong tháng 8/2026, thực hiện nghiên cứu từ tháng 9/2026 đến tháng 4/2027, nghiệm thu và thanh lý vào tháng 5/2027. Khuyến khích sinh viên tham gia Huawei ICT Competition, Robocon, BK Innovation, Liên hoan Tuổi trẻ Sáng tạo.</w:t>
       </w:r>
     </w:p>
     <w:p>
@@ -472,10 +535,10 @@
           <w:b/>
           <w:bCs/>
         </w:rPr>
-        <w:t xml:space="preserve">Mục tiêu</w:t>
-      </w:r>
-      <w:r>
-        <w:t xml:space="preserve">: Tập trung vào các đề tài ứng dụng thuật toán tối ưu (Heuristics, NSGA-II), mô phỏng chuỗi cung ứng, logistics đô thị, ứng dụng Machine Learning/Deep Learning trong dự báo nhu cầu doanh nghiệp.</w:t>
+        <w:t xml:space="preserve">Mục tiêu và Định hướng</w:t>
+      </w:r>
+      <w:r>
+        <w:t xml:space="preserve">: Tập trung vào các đề tài ứng dụng công nghệ số và phương pháp tối ưu hóa trong quản lý kinh tế và vận hành chuỗi cung ứng. Hướng nghiên cứu chủ đạo gồm ứng dụng học máy trong dự báo nhu cầu doanh nghiệp, tối ưu hóa chuỗi cung ứng logistics (Heuristics, NSGA-II), định lượng khả năng phục hồi chuỗi cung ứng dưới tác động ripple effect, và ứng dụng AI trong lập kế hoạch du lịch xanh bền vững (mô hình UTAUT2).</w:t>
       </w:r>
     </w:p>
     <w:p>
@@ -491,10 +554,10 @@
           <w:b/>
           <w:bCs/>
         </w:rPr>
-        <w:t xml:space="preserve">Lộ trình</w:t>
-      </w:r>
-      <w:r>
-        <w:t xml:space="preserve">: Triển khai đề tài trong chu kỳ 9-12 tháng bắt đầu từ tháng 9/2026.</w:t>
+        <w:t xml:space="preserve">Lộ trình triển khai</w:t>
+      </w:r>
+      <w:r>
+        <w:t xml:space="preserve">: Triển khai chu kỳ 9-12 tháng bắt đầu từ tháng 9/2026, nghiệm thu và đánh giá kết quả theo đúng quy trình chung của Khoa và Nhà trường.</w:t>
       </w:r>
     </w:p>
     <w:p>
@@ -522,10 +585,10 @@
           <w:b/>
           <w:bCs/>
         </w:rPr>
-        <w:t xml:space="preserve">Mục tiêu</w:t>
-      </w:r>
-      <w:r>
-        <w:t xml:space="preserve">: Thí điểm mô hình tổ chức NCKH bài bản 12 tháng (tháng 6/2026 - tháng 5/2027), nâng cao quy mô sinh viên tham gia nghiên cứu thực nghiệm hóa chất và thúc đẩy công bố khoa học.</w:t>
+        <w:t xml:space="preserve">Mục tiêu và Tờ trình</w:t>
+      </w:r>
+      <w:r>
+        <w:t xml:space="preserve">: Thực hiện theo Tờ trình số 182/TTr-KTHH ngày 11/06/2026, Khoa thực hiện kế hoạch 12 tháng (tháng 6/2026 - tháng 5/2027) nhằm xây dựng quy trình quản lý NCKH sinh viên chuyên nghiệp và hiệu quả. Nâng cao số lượng sinh viên tiếp cận nghiên cứu thực nghiệm hóa chất, thúc đẩy công bố khoa học.</w:t>
       </w:r>
     </w:p>
     <w:p>
@@ -544,7 +607,7 @@
         <w:t xml:space="preserve">Lộ trình</w:t>
       </w:r>
       <w:r>
-        <w:t xml:space="preserve">: Thực hiện theo lộ trình 2 đợt tương tự Khoa Cơ khí, nghiệm thu và quyết toán dứt điểm vào tháng 5/2027.</w:t>
+        <w:t xml:space="preserve">: Chia làm 2 đợt tiếp nhận và nghiệm thu tương tự Khoa Cơ khí, đảm bảo giải ngân và quyết toán dứt điểm toàn bộ kinh phí vào tháng 5/2027.</w:t>
       </w:r>
     </w:p>
     <w:p>
@@ -2340,7 +2403,10 @@
         <w:t xml:space="preserve">112,05 triệu đồng</w:t>
       </w:r>
       <w:r>
-        <w:t xml:space="preserve">.</w:t>
+        <w:t xml:space="preserve"> </w:t>
+      </w:r>
+      <w:r>
+        <w:t xml:space="preserve">(trong tổng đăng ký nhu cầu thực tế là 112,05 triệu đồng).</w:t>
       </w:r>
     </w:p>
     <w:p>
@@ -2379,13 +2445,13 @@
       </w:r>
     </w:p>
     <w:bookmarkEnd w:id="11"/>
-    <w:bookmarkStart w:id="12" w:name="X3005979cdcb317d1d3c3206addaaa8da34ec683"/>
+    <w:bookmarkStart w:id="12" w:name="X484588a2c5826090fab36d02f8aa2eca3c50611"/>
     <w:p>
       <w:pPr>
         <w:pStyle w:val="Heading3"/>
       </w:pPr>
       <w:r>
-        <w:t xml:space="preserve">2. Danh mục mua sắm tiêu biểu của các nhóm nghiên cứu</w:t>
+        <w:t xml:space="preserve">2. Danh mục mua sắm chi tiết tiêu biểu của các nhóm nghiên cứu</w:t>
       </w:r>
     </w:p>
     <w:p>
@@ -2416,7 +2482,7 @@
         </w:numPr>
       </w:pPr>
       <w:r>
-        <w:t xml:space="preserve">Linh kiện điện tử: Vi điều khiển (ESP32, Arduino), cảm biến (cảm biến khoảng cách, cảm biến lực, IMU), mạch driver động cơ, module GPS, camera nhận diện hình ảnh.</w:t>
+        <w:t xml:space="preserve">Linh kiện điện tử chuyên dụng: Vi điều khiển nhúng trên UAV, ESP32, mạch Arduino, cảm biến đo lực, cảm biến khoảng cách, cảm biến IMU, module truyền thông, module GPS, camera nhận diện hình ảnh.</w:t>
       </w:r>
     </w:p>
     <w:p>
@@ -2428,7 +2494,7 @@
         </w:numPr>
       </w:pPr>
       <w:r>
-        <w:t xml:space="preserve">Vật liệu cơ khí: Nhôm định hình, thép tấm, nhựa in 3D chuyên dụng, sợi carbon, composite chịu lực chế tạo vỏ khung xe tự hành và drone.</w:t>
+        <w:t xml:space="preserve">Vật liệu cơ khí chế tạo: Nhôm định hình, thép tấm, nhựa in 3D chuyên dụng, sợi carbon, vật liệu composite chịu lực cao dùng chế tạo vỏ khung xe tự hành, cánh sóng và các cụm thử nghiệm robot.</w:t>
       </w:r>
     </w:p>
     <w:p>
@@ -2444,7 +2510,7 @@
           <w:b/>
           <w:bCs/>
         </w:rPr>
-        <w:t xml:space="preserve">Hóa chất và vật liệu sinh học (Khoa Kỹ thuật Hóa học, Công nghệ Vật liệu, Môi trường)</w:t>
+        <w:t xml:space="preserve">Hóa chất và vật liệu sinh học (Khoa Kỹ thuật Hóa học, Công nghệ Vật liệu, Môi trường, Khoa học Ứng dụng)</w:t>
       </w:r>
       <w:r>
         <w:t xml:space="preserve">:</w:t>
@@ -2459,7 +2525,7 @@
         </w:numPr>
       </w:pPr>
       <w:r>
-        <w:t xml:space="preserve">Hóa chất phân tích &amp; tổng hợp xúc tác: KOH, PVA, NaOH, H₂SO₄, HNO₃, Ethanol nguyên chất, Nafion, niken nitrat, amoni molybdat, sắt sunfat.</w:t>
+        <w:t xml:space="preserve">Hóa chất phân tích &amp; tổng hợp xúc tác: Hóa chất tinh khiết KOH, PVA, NaOH, H₂SO₄, HNO₃, cồn công nghiệp 96-98%, dung dịch Nafion 1100EW, các muối mangan(II) clorua MnCl2, thiếc(IV) clorua, đồng sunfat, sắt sunfat, boric acid, natri thiosunfat, amoni molybdat cấp AR.</w:t>
       </w:r>
     </w:p>
     <w:p>
@@ -2471,7 +2537,7 @@
         </w:numPr>
       </w:pPr>
       <w:r>
-        <w:t xml:space="preserve">Thiết bị phụ trợ thí nghiệm: Điện cực glassy carbon, màng bọc cao su chịu hóa chất, giấy lọc dầu, ống ly tâm siêu tốc, bóp cao su 3 van kháng hóa chất.</w:t>
+        <w:t xml:space="preserve">Thiết bị phụ trợ và dụng cụ thủy tinh: Điện cực glassy carbon chữ L 6mm, micropipette kích thước 0.5-10 uL và 100-1000uL, hộp đựng tip nhựa polypropylene kháng hóa chất, chén nung sứ và nung kim loại 100cc, màng bọc cao su chịu lực, giấy lọc, dây o-ring làm kín.</w:t>
       </w:r>
     </w:p>
     <w:p>
@@ -2487,7 +2553,7 @@
           <w:b/>
           <w:bCs/>
         </w:rPr>
-        <w:t xml:space="preserve">Thành phần thiết bị đo lường chuyên dụng (Khoa Địa chất &amp; Dầu khí, Khoa học Ứng dụng)</w:t>
+        <w:t xml:space="preserve">Thành phần thiết bị đo lường và khảo sát (Khoa Địa chất &amp; Dầu khí, Khoa học Ứng dụng)</w:t>
       </w:r>
       <w:r>
         <w:t xml:space="preserve">:</w:t>
@@ -2502,7 +2568,7 @@
         </w:numPr>
       </w:pPr>
       <w:r>
-        <w:t xml:space="preserve">Ống kính macro chuyên dụng đo biến dạng mẫu đá, đèn flash công suất lớn, tripod chịu tải cao.</w:t>
+        <w:t xml:space="preserve">Thiết bị quang học đo biến dạng: Ống kính macro chuyên dụng lắp trên camera đo biến dạng mẫu đá, đèn flash công suất lớn, tripod chịu tải cao.</w:t>
       </w:r>
     </w:p>
     <w:p>
@@ -2514,7 +2580,7 @@
         </w:numPr>
       </w:pPr>
       <w:r>
-        <w:t xml:space="preserve">Thiết bị đo sinh tồn (PPG), linh kiện lắp ráp hệ thống robot 6 bậc tự do.</w:t>
+        <w:t xml:space="preserve">Thiết bị y sinh và y học: Gel tẩy da NuPrep, gel kết nối điện cực đo điện não Ten20 phục vụ phân tích tín hiệu EEG, thiết bị đo sinh tồn (PPG).</w:t>
       </w:r>
     </w:p>
     <w:p>
@@ -2526,7 +2592,7 @@
     </w:p>
     <w:bookmarkEnd w:id="12"/>
     <w:bookmarkEnd w:id="13"/>
-    <w:bookmarkStart w:id="16" w:name="X47dd4feccb122b71a6a24d5328ecb1b17d45d26"/>
+    <w:bookmarkStart w:id="17" w:name="X47dd4feccb122b71a6a24d5328ecb1b17d45d26"/>
     <w:p>
       <w:pPr>
         <w:pStyle w:val="Heading2"/>
@@ -2629,13 +2695,13 @@
       </w:r>
     </w:p>
     <w:bookmarkEnd w:id="14"/>
-    <w:bookmarkStart w:id="15" w:name="X1e7e5daaa15f7c9359db3e906cb2c9891088cb1"/>
+    <w:bookmarkStart w:id="15" w:name="X8e136628242fee2c02d3486c0c617cf8f62b5c3"/>
     <w:p>
       <w:pPr>
         <w:pStyle w:val="Heading3"/>
       </w:pPr>
       <w:r>
-        <w:t xml:space="preserve">2. Tổng hợp kinh phí dành cho Hội nghị, Hội thảo (HN, HT)</w:t>
+        <w:t xml:space="preserve">2. Định hướng tham gia các cuộc thi học thuật lớn</w:t>
       </w:r>
     </w:p>
     <w:p>
@@ -2647,6 +2713,28 @@
         </w:numPr>
       </w:pPr>
       <w:r>
+        <w:t xml:space="preserve">Định hướng đưa các sản phẩm nghiên cứu thực tế tham gia tranh tài tại các cuộc thi công nghệ và học thuật uy tín như Huawei ICT Competition, Robocon, BK Innovation, Giải thưởng Khoa học và Công nghệ dành cho sinh viên trong các cơ sở giáo dục Đại học của Bộ GD&amp;ĐT, và Liên hoan Tuổi trẻ Sáng tạo.</w:t>
+      </w:r>
+    </w:p>
+    <w:bookmarkEnd w:id="15"/>
+    <w:bookmarkStart w:id="16" w:name="X1e7e5daaa15f7c9359db3e906cb2c9891088cb1"/>
+    <w:p>
+      <w:pPr>
+        <w:pStyle w:val="Heading3"/>
+      </w:pPr>
+      <w:r>
+        <w:t xml:space="preserve">3. Tổng hợp kinh phí dành cho Hội nghị, Hội thảo (HN, HT)</w:t>
+      </w:r>
+    </w:p>
+    <w:p>
+      <w:pPr>
+        <w:pStyle w:val="Compact"/>
+        <w:numPr>
+          <w:ilvl w:val="0"/>
+          <w:numId w:val="1018"/>
+        </w:numPr>
+      </w:pPr>
+      <w:r>
         <w:rPr>
           <w:b/>
           <w:bCs/>
@@ -2678,7 +2766,7 @@
         <w:pStyle w:val="Compact"/>
         <w:numPr>
           <w:ilvl w:val="0"/>
-          <w:numId w:val="1017"/>
+          <w:numId w:val="1018"/>
         </w:numPr>
       </w:pPr>
       <w:r>
@@ -2713,7 +2801,7 @@
         <w:pStyle w:val="Compact"/>
         <w:numPr>
           <w:ilvl w:val="0"/>
-          <w:numId w:val="1017"/>
+          <w:numId w:val="1018"/>
         </w:numPr>
       </w:pPr>
       <w:r>
@@ -2748,7 +2836,7 @@
         <w:pStyle w:val="Compact"/>
         <w:numPr>
           <w:ilvl w:val="0"/>
-          <w:numId w:val="1017"/>
+          <w:numId w:val="1018"/>
         </w:numPr>
       </w:pPr>
       <w:r>
@@ -2785,9 +2873,9 @@
         </w:pict>
       </w:r>
     </w:p>
-    <w:bookmarkEnd w:id="15"/>
     <w:bookmarkEnd w:id="16"/>
-    <w:bookmarkStart w:id="21" w:name="Xcee393445b776e64d9fb4aefe1eadd723cf11c3"/>
+    <w:bookmarkEnd w:id="17"/>
+    <w:bookmarkStart w:id="22" w:name="Xcee393445b776e64d9fb4aefe1eadd723cf11c3"/>
     <w:p>
       <w:pPr>
         <w:pStyle w:val="Heading2"/>
@@ -2804,61 +2892,13 @@
         <w:t xml:space="preserve">Để hoạt động NCKH &amp; ĐMST cấp sinh viên năm 2026 đạt hiệu quả thực chất, các khoa đã đưa ra một số đề xuất quan trọng gửi Phòng Khoa học &amp; Công nghệ, Phòng Kế hoạch - Tài chính và Ban Giám hiệu Trường:</w:t>
       </w:r>
     </w:p>
-    <w:bookmarkStart w:id="17" w:name="Xb3419dc1c90eba4618d4d53ee25cadcacd89711"/>
+    <w:bookmarkStart w:id="18" w:name="Xd97f92f908a7cea22e6b9e255acf77abcb5578b"/>
     <w:p>
       <w:pPr>
         <w:pStyle w:val="Heading3"/>
       </w:pPr>
       <w:r>
-        <w:t xml:space="preserve">1. Đề xuất về cơ chế tài chính mới (Khoa Cơ khí, Hóa học)</w:t>
-      </w:r>
-    </w:p>
-    <w:p>
-      <w:pPr>
-        <w:pStyle w:val="Compact"/>
-        <w:numPr>
-          <w:ilvl w:val="0"/>
-          <w:numId w:val="1018"/>
-        </w:numPr>
-      </w:pPr>
-      <w:r>
-        <w:rPr>
-          <w:b/>
-          <w:bCs/>
-        </w:rPr>
-        <w:t xml:space="preserve">Bồi dưỡng sinh viên</w:t>
-      </w:r>
-      <w:r>
-        <w:t xml:space="preserve">: Đề nghị nhà trường cho phép áp dụng định mức bồi dưỡng cho sinh viên trực tiếp thực hiện đề tài (dự kiến chiếm ≈15% giá trị đề tài) nhằm tạo động lực nghiên cứu.</w:t>
-      </w:r>
-    </w:p>
-    <w:p>
-      <w:pPr>
-        <w:pStyle w:val="Compact"/>
-        <w:numPr>
-          <w:ilvl w:val="0"/>
-          <w:numId w:val="1018"/>
-        </w:numPr>
-      </w:pPr>
-      <w:r>
-        <w:rPr>
-          <w:b/>
-          <w:bCs/>
-        </w:rPr>
-        <w:t xml:space="preserve">Chi phí khảo sát thực địa</w:t>
-      </w:r>
-      <w:r>
-        <w:t xml:space="preserve">: Đề xuất xây dựng định mức chi phí đi lại, khảo sát và thu thập số liệu thực địa cho sinh viên (dự kiến chiếm ≈10% kinh phí phân bổ), đặc biệt cần thiết cho các đề tài ngành Địa chất, Dầu khí, Môi trường.</w:t>
-      </w:r>
-    </w:p>
-    <w:bookmarkEnd w:id="17"/>
-    <w:bookmarkStart w:id="18" w:name="X8c481c32c959c4098bdc5ac0ed91460059623d6"/>
-    <w:p>
-      <w:pPr>
-        <w:pStyle w:val="Heading3"/>
-      </w:pPr>
-      <w:r>
-        <w:t xml:space="preserve">2. Đề xuất quy trình và biểu mẫu mua sắm (Khoa KHUD, Giao thông, Máy tính)</w:t>
+        <w:t xml:space="preserve">1. Đề xuất về cơ chế tài chính và định mức hỗ trợ (Khoa Cơ khí, Hóa học, Địa chất, Môi trường)</w:t>
       </w:r>
     </w:p>
     <w:p>
@@ -2874,10 +2914,10 @@
           <w:b/>
           <w:bCs/>
         </w:rPr>
-        <w:t xml:space="preserve">Quy trình mua sắm</w:t>
-      </w:r>
-      <w:r>
-        <w:t xml:space="preserve">: Đề nghị Phòng KH&amp;CN và Phòng Quản trị Thiết bị hướng dẫn chi tiết quy trình mua sắm đối với các hóa chất thí nghiệm (đặc biệt là hóa chất độc hại, hóa chất thuộc danh mục kiểm soát), linh kiện điện tử chuyên dụng nhập khẩu và các phần mềm bản quyền nghiên cứu.</w:t>
+        <w:t xml:space="preserve">Hỗ trợ kinh phí sinh viên</w:t>
+      </w:r>
+      <w:r>
+        <w:t xml:space="preserve">: Kiến nghị áp dụng cơ chế cho phép chi bồi dưỡng trực tiếp cho sinh viên tham gia thực hiện đề tài (dự kiến định mức ≈15% giá trị đề tài) nhằm tạo động lực và nâng cao trách nhiệm nghiên cứu của sinh viên.</w:t>
       </w:r>
     </w:p>
     <w:p>
@@ -2893,20 +2933,39 @@
           <w:b/>
           <w:bCs/>
         </w:rPr>
-        <w:t xml:space="preserve">Quy trình giải ngân</w:t>
-      </w:r>
-      <w:r>
-        <w:t xml:space="preserve">: Đề nghị nhà trường hỗ trợ thủ tục lập dự toán nhanh chóng, rút ngắn thời gian mua sắm bàn giao vật tư (hiện tại quy trình thông thường mất khoảng 30 ngày) để tránh làm gián đoạn tiến độ thực hiện đề tài của sinh viên.</w:t>
+        <w:t xml:space="preserve">Đặc thù ngành</w:t>
+      </w:r>
+      <w:r>
+        <w:t xml:space="preserve">: Kiến nghị xây dựng định mức chi phí đi lại, khảo sát thực địa và thu thập số liệu hiện trường cho sinh viên (dự kiến chiếm ≈10% kinh phí phân bổ), đặc biệt cần thiết cho các ngành có khối lượng công việc thực địa lớn như Địa chất Dầu khí, Môi trường và Tài nguyên.</w:t>
+      </w:r>
+    </w:p>
+    <w:p>
+      <w:pPr>
+        <w:pStyle w:val="Compact"/>
+        <w:numPr>
+          <w:ilvl w:val="0"/>
+          <w:numId w:val="1019"/>
+        </w:numPr>
+      </w:pPr>
+      <w:r>
+        <w:rPr>
+          <w:b/>
+          <w:bCs/>
+        </w:rPr>
+        <w:t xml:space="preserve">Tăng hạn mức kinh phí</w:t>
+      </w:r>
+      <w:r>
+        <w:t xml:space="preserve">: Một số khoa (như Môi trường và Tài nguyên, Công nghệ Vật liệu) đề nghị nhà trường xem xét nâng hạn mức kinh phí phân bổ thực tế vì nhu cầu đăng ký và tính toán dự toán hóa chất, thiết bị thực tế của sinh viên vượt xa hạn mức trường duyệt.</w:t>
       </w:r>
     </w:p>
     <w:bookmarkEnd w:id="18"/>
-    <w:bookmarkStart w:id="19" w:name="Xb2bf54675483500ac321bab2f4cd5706f62ba53"/>
+    <w:bookmarkStart w:id="19" w:name="X116e987abf8a409e85ca5c93535322323fe92ca"/>
     <w:p>
       <w:pPr>
         <w:pStyle w:val="Heading3"/>
       </w:pPr>
       <w:r>
-        <w:t xml:space="preserve">3. Đề xuất hỗ trợ giảng viên hướng dẫn (Khoa Cơ khí, KH&amp;KTMT, KTHH)</w:t>
+        <w:t xml:space="preserve">2. Đề xuất cải tiến quy trình hành chính và mua sắm (Khoa KHUD, Giao thông, Máy tính, Vật liệu)</w:t>
       </w:r>
     </w:p>
     <w:p>
@@ -2922,20 +2981,39 @@
           <w:b/>
           <w:bCs/>
         </w:rPr>
-        <w:t xml:space="preserve">Ghi nhận công sức</w:t>
-      </w:r>
-      <w:r>
-        <w:t xml:space="preserve">: Đề xuất Phòng KH&amp;CN ban hành hướng dẫn chi tiết quy trình tính điểm Nhiệm vụ 2 (quy đổi giờ chuẩn giảng dạy) và kinh phí bồi dưỡng hướng dẫn cho giảng viên hướng dẫn đề tài NCKH sinh viên để đảm bảo quyền lợi và khuyến khích thầy/cô đồng hành cùng sinh viên.</w:t>
+        <w:t xml:space="preserve">Quy trình hóa chất &amp; thiết bị chuyên dụng</w:t>
+      </w:r>
+      <w:r>
+        <w:t xml:space="preserve">: Hướng dẫn chi tiết quy trình mua sắm, nhập khẩu và quản lý sử dụng các hóa chất thí nghiệm thuộc danh mục kiểm soát (hóa chất độc hại), các linh kiện điện tử chuyên dụng nhập khẩu và các phần mềm bản quyền mô phỏng nghiên cứu.</w:t>
+      </w:r>
+    </w:p>
+    <w:p>
+      <w:pPr>
+        <w:pStyle w:val="Compact"/>
+        <w:numPr>
+          <w:ilvl w:val="0"/>
+          <w:numId w:val="1020"/>
+        </w:numPr>
+      </w:pPr>
+      <w:r>
+        <w:rPr>
+          <w:b/>
+          <w:bCs/>
+        </w:rPr>
+        <w:t xml:space="preserve">Rút ngắn thời gian giải ngân</w:t>
+      </w:r>
+      <w:r>
+        <w:t xml:space="preserve">: Đề xuất tối ưu hóa quy trình duyệt hồ sơ mua sắm và giải ngân (rút ngắn thời gian thông thường 30 ngày xuống mức tối thiểu) để tránh làm gián đoạn tiến độ thực hiện đề tài của sinh viên, đặc biệt với các đề tài chế tạo thực nghiệm chỉ có chu kỳ 12 tháng.</w:t>
       </w:r>
     </w:p>
     <w:bookmarkEnd w:id="19"/>
-    <w:bookmarkStart w:id="20" w:name="X70bba4e150e006b1e4be375c21ed6142e0c5905"/>
+    <w:bookmarkStart w:id="20" w:name="X6cfc1a300c184fee9e39a79e558801eea05c692"/>
     <w:p>
       <w:pPr>
         <w:pStyle w:val="Heading3"/>
       </w:pPr>
       <w:r>
-        <w:t xml:space="preserve">4. Hỗ trợ tham gia cuộc thi ngoài trường (Khoa Cơ khí, KTHH)</w:t>
+        <w:t xml:space="preserve">3. Đề xuất cơ chế ghi nhận cho giảng viên hướng dẫn (Khoa Cơ khí, KH&amp;KTMT, KTHH)</w:t>
       </w:r>
     </w:p>
     <w:p>
@@ -2951,13 +3029,41 @@
           <w:b/>
           <w:bCs/>
         </w:rPr>
-        <w:t xml:space="preserve">Kết nối thủ tục</w:t>
-      </w:r>
-      <w:r>
-        <w:t xml:space="preserve">: Đề xuất Phòng Công tác Sinh viên (CTSV) hỗ trợ tối đa quy trình tiếp nhận hồ sơ hỗ trợ sinh viên tham gia các cuộc thi học thuật ngoài trường (theo quy trình BK-QT-ED-056-05) nhằm tạo cơ hội cọ xát thực tế cho sinh viên sau khi hoàn thành đề tài cấp cơ sở.</w:t>
+        <w:t xml:space="preserve">Ghi nhận công sức giảng viên</w:t>
+      </w:r>
+      <w:r>
+        <w:t xml:space="preserve">: Đề nghị Phòng KH&amp;CN ban hành hướng dẫn cụ thể về việc tính điểm Nhiệm vụ 2 (quy đổi giờ chuẩn giảng dạy) và hỗ trợ kinh phí bồi dưỡng hướng dẫn cho giảng viên hướng dẫn đề tài NCKH sinh viên nhằm khuyến khích giảng viên đồng hành lâu dài cùng các nhóm sinh viên.</w:t>
       </w:r>
     </w:p>
     <w:bookmarkEnd w:id="20"/>
+    <w:bookmarkStart w:id="21" w:name="X7cc86d7f809d90b5429e4ee611bce560c0499fe"/>
+    <w:p>
+      <w:pPr>
+        <w:pStyle w:val="Heading3"/>
+      </w:pPr>
+      <w:r>
+        <w:t xml:space="preserve">4. Đề xuất cơ chế phối hợp tham gia cuộc thi ngoài trường (Khoa Cơ khí, KTHH)</w:t>
+      </w:r>
+    </w:p>
+    <w:p>
+      <w:pPr>
+        <w:pStyle w:val="Compact"/>
+        <w:numPr>
+          <w:ilvl w:val="0"/>
+          <w:numId w:val="1022"/>
+        </w:numPr>
+      </w:pPr>
+      <w:r>
+        <w:rPr>
+          <w:b/>
+          <w:bCs/>
+        </w:rPr>
+        <w:t xml:space="preserve">Tạo điều kiện tham gia cuộc thi</w:t>
+      </w:r>
+      <w:r>
+        <w:t xml:space="preserve">: Kiến nghị Phòng Công tác Sinh viên (CTSV) hỗ trợ đơn giản hóa quy trình tiếp nhận hồ sơ, làm thủ tục đề cử sinh viên tham gia các cuộc thi học thuật ngoài trường (theo quy trình BK-QT-ED-056-05) nhằm tạo cơ hội cọ xát thực tế cho sinh viên sau khi hoàn thành đề tài cấp cơ sở.</w:t>
+      </w:r>
+    </w:p>
     <w:bookmarkEnd w:id="21"/>
     <w:bookmarkEnd w:id="22"/>
     <w:sectPr>
@@ -3237,6 +3343,9 @@
     <w:abstractNumId w:val="991"/>
   </w:num>
   <w:num w:numId="1021">
+    <w:abstractNumId w:val="991"/>
+  </w:num>
+  <w:num w:numId="1022">
     <w:abstractNumId w:val="991"/>
   </w:num>
 </w:numbering>

</xml_diff>